<commit_message>
1 punkt lab 3
</commit_message>
<xml_diff>
--- a/Lab2/LELA1_LAB2_Rah_Sal.docx
+++ b/Lab2/LELA1_LAB2_Rah_Sal.docx
@@ -2767,39 +2767,13 @@
                     <w:rPr>
                       <w:rFonts w:ascii="Cambria Math" w:hAnsi="Cambria Math" w:cstheme="minorHAnsi"/>
                     </w:rPr>
-                    <m:t>R2</m:t>
+                    <m:t>R</m:t>
                   </m:r>
-                </m:sub>
-              </m:sSub>
-              <m:r>
-                <w:rPr>
-                  <w:rFonts w:ascii="Cambria Math" w:hAnsi="Cambria Math" w:cstheme="minorHAnsi"/>
-                </w:rPr>
-                <m:t>-</m:t>
-              </m:r>
-              <m:sSub>
-                <m:sSubPr>
-                  <m:ctrlPr>
-                    <w:rPr>
-                      <w:rFonts w:ascii="Cambria Math" w:hAnsi="Cambria Math" w:cstheme="minorHAnsi"/>
-                      <w:i/>
-                    </w:rPr>
-                  </m:ctrlPr>
-                </m:sSubPr>
-                <m:e>
                   <m:r>
                     <w:rPr>
                       <w:rFonts w:ascii="Cambria Math" w:hAnsi="Cambria Math" w:cstheme="minorHAnsi"/>
                     </w:rPr>
-                    <m:t>U</m:t>
-                  </m:r>
-                </m:e>
-                <m:sub>
-                  <m:r>
-                    <w:rPr>
-                      <w:rFonts w:ascii="Cambria Math" w:hAnsi="Cambria Math" w:cstheme="minorHAnsi"/>
-                    </w:rPr>
-                    <m:t>BE</m:t>
+                    <m:t>4</m:t>
                   </m:r>
                 </m:sub>
               </m:sSub>
@@ -2853,7 +2827,21 @@
                 <w:rPr>
                   <w:rFonts w:ascii="Cambria Math" w:hAnsi="Cambria Math" w:cstheme="minorHAnsi"/>
                 </w:rPr>
-                <m:t>5,33 V -0,66 V</m:t>
+                <m:t>4,67</m:t>
+              </m:r>
+              <w:bookmarkStart w:id="0" w:name="_GoBack"/>
+              <w:bookmarkEnd w:id="0"/>
+              <m:r>
+                <w:rPr>
+                  <w:rFonts w:ascii="Cambria Math" w:hAnsi="Cambria Math" w:cstheme="minorHAnsi"/>
+                </w:rPr>
+                <m:t xml:space="preserve"> V</m:t>
+              </m:r>
+              <m:r>
+                <w:rPr>
+                  <w:rFonts w:ascii="Cambria Math" w:hAnsi="Cambria Math" w:cstheme="minorHAnsi"/>
+                </w:rPr>
+                <m:t> </m:t>
               </m:r>
             </m:num>
             <m:den>
@@ -10699,8 +10687,6 @@
                 </w:rPr>
                 <m:t>m</m:t>
               </m:r>
-              <w:bookmarkStart w:id="0" w:name="_GoBack"/>
-              <w:bookmarkEnd w:id="0"/>
               <m:r>
                 <w:rPr>
                   <w:rFonts w:ascii="Cambria Math" w:hAnsi="Cambria Math" w:cstheme="minorHAnsi"/>
@@ -18650,7 +18636,7 @@
 </file>
 
 <file path=customXml/itemProps1.xml><?xml version="1.0" encoding="utf-8"?>
-<ds:datastoreItem xmlns:ds="http://schemas.openxmlformats.org/officeDocument/2006/customXml" ds:itemID="{DB016C9A-B504-47CC-B6F5-47D6E2D96F53}">
+<ds:datastoreItem xmlns:ds="http://schemas.openxmlformats.org/officeDocument/2006/customXml" ds:itemID="{8C23FE51-76D1-4F68-A255-A215381FE8B6}">
   <ds:schemaRefs>
     <ds:schemaRef ds:uri="http://schemas.openxmlformats.org/officeDocument/2006/bibliography"/>
   </ds:schemaRefs>

</xml_diff>